<commit_message>
keep in mind added
</commit_message>
<xml_diff>
--- a/concept_note.docx
+++ b/concept_note.docx
@@ -48,6 +48,156 @@
       </w:pPr>
       <w:r>
         <w:t xml:space="preserve">2026-09-25</w:t>
+      </w:r>
+    </w:p>
+    <w:p>
+      <w:pPr>
+        <w:pStyle w:val="FirstParagraph"/>
+      </w:pPr>
+      <w:r>
+        <w:rPr>
+          <w:i/>
+          <w:iCs/>
+        </w:rPr>
+        <w:t xml:space="preserve">Keep in mind - important to be eligible for submission!*</w:t>
+      </w:r>
+    </w:p>
+    <w:p>
+      <w:pPr>
+        <w:pStyle w:val="Compact"/>
+        <w:numPr>
+          <w:ilvl w:val="0"/>
+          <w:numId w:val="1001"/>
+        </w:numPr>
+      </w:pPr>
+      <w:r>
+        <w:rPr>
+          <w:i/>
+          <w:iCs/>
+        </w:rPr>
+        <w:t xml:space="preserve">This is a two-stage call with the first stage being a 10-page</w:t>
+      </w:r>
+      <w:r>
+        <w:rPr>
+          <w:i/>
+          <w:iCs/>
+        </w:rPr>
+        <w:t xml:space="preserve"> </w:t>
+      </w:r>
+      <w:r>
+        <w:rPr>
+          <w:b/>
+          <w:bCs/>
+          <w:i/>
+          <w:iCs/>
+        </w:rPr>
+        <w:t xml:space="preserve">blind</w:t>
+      </w:r>
+      <w:r>
+        <w:rPr>
+          <w:i/>
+          <w:iCs/>
+        </w:rPr>
+        <w:t xml:space="preserve"> </w:t>
+      </w:r>
+      <w:r>
+        <w:rPr>
+          <w:i/>
+          <w:iCs/>
+        </w:rPr>
+        <w:t xml:space="preserve">submission, meaning no names of researchers, no institutions are named (only in second stage) - of course, we should still have all personnel in place when submitting to the first stage</w:t>
+      </w:r>
+    </w:p>
+    <w:p>
+      <w:pPr>
+        <w:pStyle w:val="Compact"/>
+        <w:numPr>
+          <w:ilvl w:val="0"/>
+          <w:numId w:val="1001"/>
+        </w:numPr>
+      </w:pPr>
+      <w:r>
+        <w:rPr>
+          <w:i/>
+          <w:iCs/>
+        </w:rPr>
+        <w:t xml:space="preserve">We need at least one but ideally more civil society institutions as beneficiary (WP lead) or affiliated partner (Taks lead). I suggest Tactical Tech (or similar) is the main lead of WP9 and we try to get a fact-checking organisation on board for WP4 plus maybe another think tank to partner with us for dissemination (WP10).</w:t>
+      </w:r>
+    </w:p>
+    <w:p>
+      <w:pPr>
+        <w:pStyle w:val="Compact"/>
+        <w:numPr>
+          <w:ilvl w:val="0"/>
+          <w:numId w:val="1001"/>
+        </w:numPr>
+      </w:pPr>
+      <w:r>
+        <w:rPr>
+          <w:i/>
+          <w:iCs/>
+        </w:rPr>
+        <w:t xml:space="preserve">We need to have at least one policy-making institution being involved - not necessarily as beneficiary but as affiliated partner(s). DFAT and a European component…? Any ideas?</w:t>
+      </w:r>
+    </w:p>
+    <w:p>
+      <w:pPr>
+        <w:pStyle w:val="Compact"/>
+        <w:numPr>
+          <w:ilvl w:val="0"/>
+          <w:numId w:val="1001"/>
+        </w:numPr>
+      </w:pPr>
+      <w:r>
+        <w:rPr>
+          <w:i/>
+          <w:iCs/>
+        </w:rPr>
+        <w:t xml:space="preserve">We need to have a midterm assessment of our outcomes in place, with specific democracy practicioners and policy-makers committed to do so when we submit!</w:t>
+      </w:r>
+    </w:p>
+    <w:p>
+      <w:pPr>
+        <w:pStyle w:val="Compact"/>
+        <w:numPr>
+          <w:ilvl w:val="0"/>
+          <w:numId w:val="1001"/>
+        </w:numPr>
+      </w:pPr>
+      <w:r>
+        <w:rPr>
+          <w:i/>
+          <w:iCs/>
+        </w:rPr>
+        <w:t xml:space="preserve">I re-read the other (single-stage) call again on</w:t>
+      </w:r>
+      <w:r>
+        <w:rPr>
+          <w:i/>
+          <w:iCs/>
+        </w:rPr>
+        <w:t xml:space="preserve"> </w:t>
+      </w:r>
+      <w:r>
+        <w:rPr>
+          <w:i/>
+          <w:iCs/>
+        </w:rPr>
+        <w:t xml:space="preserve">“Addressing the impact of artificial intelligence, cyberviolence, and deepfakes on equality, democracy and inclusive societies”</w:t>
+      </w:r>
+      <w:r>
+        <w:rPr>
+          <w:i/>
+          <w:iCs/>
+        </w:rPr>
+        <w:t xml:space="preserve"> </w:t>
+      </w:r>
+      <w:r>
+        <w:rPr>
+          <w:i/>
+          <w:iCs/>
+        </w:rPr>
+        <w:t xml:space="preserve">and suggest we only focus on this call if we do not make it to the second stage of the other call as we would need to re-structure our proposal substantially to also cover cyberviolence and it would also need to become much more techy.</w:t>
       </w:r>
     </w:p>
     <w:p>
@@ -718,7 +868,7 @@
       <w:pPr>
         <w:numPr>
           <w:ilvl w:val="0"/>
-          <w:numId w:val="1001"/>
+          <w:numId w:val="1002"/>
         </w:numPr>
       </w:pPr>
       <w:r>
@@ -733,173 +883,6 @@
       </w:r>
       <w:r>
         <w:t xml:space="preserve">— Which concepts from political science and AI research does a shared framework need to reconcile? Output: a literature synthesis spanning both fields.</w:t>
-      </w:r>
-    </w:p>
-    <w:p>
-      <w:pPr>
-        <w:numPr>
-          <w:ilvl w:val="0"/>
-          <w:numId w:val="1001"/>
-        </w:numPr>
-      </w:pPr>
-      <w:r>
-        <w:rPr>
-          <w:b/>
-          <w:bCs/>
-        </w:rPr>
-        <w:t xml:space="preserve">Task 1.2: Building a shared coding scheme</w:t>
-      </w:r>
-      <w:r>
-        <w:t xml:space="preserve"> </w:t>
-      </w:r>
-      <w:r>
-        <w:t xml:space="preserve">— How should</w:t>
-      </w:r>
-      <w:r>
-        <w:t xml:space="preserve"> </w:t>
-      </w:r>
-      <w:r>
-        <w:t xml:space="preserve">“risk”</w:t>
-      </w:r>
-      <w:r>
-        <w:t xml:space="preserve"> </w:t>
-      </w:r>
-      <w:r>
-        <w:t xml:space="preserve">and</w:t>
-      </w:r>
-      <w:r>
-        <w:t xml:space="preserve"> </w:t>
-      </w:r>
-      <w:r>
-        <w:t xml:space="preserve">“benefit”</w:t>
-      </w:r>
-      <w:r>
-        <w:t xml:space="preserve"> </w:t>
-      </w:r>
-      <w:r>
-        <w:t xml:space="preserve">be operationalized consistently across all other WPs? Output: a shared coding scheme used project-wide.</w:t>
-      </w:r>
-    </w:p>
-    <w:p>
-      <w:pPr>
-        <w:numPr>
-          <w:ilvl w:val="0"/>
-          <w:numId w:val="1001"/>
-        </w:numPr>
-      </w:pPr>
-      <w:r>
-        <w:rPr>
-          <w:b/>
-          <w:bCs/>
-        </w:rPr>
-        <w:t xml:space="preserve">Task 1.3: Selecting comparative cases</w:t>
-      </w:r>
-      <w:r>
-        <w:t xml:space="preserve"> </w:t>
-      </w:r>
-      <w:r>
-        <w:t xml:space="preserve">— Which cases in the EU, Australia, and Southeast Asia/Pacific give the fullest range of AI’s disruptive power? Output: the project’s comparative case selection.</w:t>
-      </w:r>
-    </w:p>
-    <w:p>
-      <w:pPr>
-        <w:numPr>
-          <w:ilvl w:val="0"/>
-          <w:numId w:val="1001"/>
-        </w:numPr>
-      </w:pPr>
-      <w:r>
-        <w:rPr>
-          <w:b/>
-          <w:bCs/>
-        </w:rPr>
-        <w:t xml:space="preserve">Task 1.4: Building the diagnostic tool</w:t>
-      </w:r>
-      <w:r>
-        <w:t xml:space="preserve"> </w:t>
-      </w:r>
-      <w:r>
-        <w:t xml:space="preserve">— How can the framework be made usable outside academia? Output: the framework paper, policy briefs, and the Resilience Diagnostic web tool.</w:t>
-      </w:r>
-    </w:p>
-    <w:p>
-      <w:pPr>
-        <w:pStyle w:val="FirstParagraph"/>
-      </w:pPr>
-      <w:r>
-        <w:rPr>
-          <w:b/>
-          <w:bCs/>
-        </w:rPr>
-        <w:t xml:space="preserve">Preliminary budget:</w:t>
-      </w:r>
-      <w:r>
-        <w:t xml:space="preserve"> </w:t>
-      </w:r>
-      <w:r>
-        <w:t xml:space="preserve">€300,000 (preliminary — total project budget ÷ 10 WPs).</w:t>
-      </w:r>
-    </w:p>
-    <w:bookmarkEnd w:id="31"/>
-    <w:bookmarkStart w:id="32" w:name="wp2-citizen-trust"/>
-    <w:p>
-      <w:pPr>
-        <w:pStyle w:val="Heading3"/>
-      </w:pPr>
-      <w:r>
-        <w:t xml:space="preserve">4.2 WP2: Citizen Trust</w:t>
-      </w:r>
-    </w:p>
-    <w:p>
-      <w:pPr>
-        <w:pStyle w:val="FirstParagraph"/>
-      </w:pPr>
-      <w:r>
-        <w:rPr>
-          <w:b/>
-          <w:bCs/>
-        </w:rPr>
-        <w:t xml:space="preserve">Research question:</w:t>
-      </w:r>
-      <w:r>
-        <w:t xml:space="preserve"> </w:t>
-      </w:r>
-      <w:r>
-        <w:t xml:space="preserve">Does exposure to AI-generated political content erode citizens’ trust in democratic institutions, and can calibrated AI transparency tools rebuild it?</w:t>
-      </w:r>
-    </w:p>
-    <w:p>
-      <w:pPr>
-        <w:pStyle w:val="BodyText"/>
-      </w:pPr>
-      <w:r>
-        <w:rPr>
-          <w:b/>
-          <w:bCs/>
-        </w:rPr>
-        <w:t xml:space="preserve">Lead:</w:t>
-      </w:r>
-      <w:r>
-        <w:t xml:space="preserve"> </w:t>
-      </w:r>
-      <w:r>
-        <w:t xml:space="preserve">Sanhueza Petrarca, Jackman, Kolczynska ·</w:t>
-      </w:r>
-      <w:r>
-        <w:t xml:space="preserve"> </w:t>
-      </w:r>
-      <w:r>
-        <w:rPr>
-          <w:b/>
-          <w:bCs/>
-        </w:rPr>
-        <w:t xml:space="preserve">Impact:</w:t>
-      </w:r>
-      <w:r>
-        <w:t xml:space="preserve"> </w:t>
-      </w:r>
-      <w:r>
-        <w:t xml:space="preserve">gives electoral commissions and civic educators an evidence-based, field-tested way to counter AI-driven trust erosion rather than guessing at it.</w:t>
       </w:r>
     </w:p>
     <w:p>
@@ -914,13 +897,37 @@
           <w:b/>
           <w:bCs/>
         </w:rPr>
-        <w:t xml:space="preserve">Task 2.1: Measuring the erosion</w:t>
-      </w:r>
-      <w:r>
-        <w:t xml:space="preserve"> </w:t>
-      </w:r>
-      <w:r>
-        <w:t xml:space="preserve">— How much does exposure to AI-generated political content shift citizens’ trust in specific institutions? Output: a panel survey measuring trust before and after exposure, feeding the public-trust index.</w:t>
+        <w:t xml:space="preserve">Task 1.2: Building a shared coding scheme</w:t>
+      </w:r>
+      <w:r>
+        <w:t xml:space="preserve"> </w:t>
+      </w:r>
+      <w:r>
+        <w:t xml:space="preserve">— How should</w:t>
+      </w:r>
+      <w:r>
+        <w:t xml:space="preserve"> </w:t>
+      </w:r>
+      <w:r>
+        <w:t xml:space="preserve">“risk”</w:t>
+      </w:r>
+      <w:r>
+        <w:t xml:space="preserve"> </w:t>
+      </w:r>
+      <w:r>
+        <w:t xml:space="preserve">and</w:t>
+      </w:r>
+      <w:r>
+        <w:t xml:space="preserve"> </w:t>
+      </w:r>
+      <w:r>
+        <w:t xml:space="preserve">“benefit”</w:t>
+      </w:r>
+      <w:r>
+        <w:t xml:space="preserve"> </w:t>
+      </w:r>
+      <w:r>
+        <w:t xml:space="preserve">be operationalized consistently across all other WPs? Output: a shared coding scheme used project-wide.</w:t>
       </w:r>
     </w:p>
     <w:p>
@@ -935,13 +942,13 @@
           <w:b/>
           <w:bCs/>
         </w:rPr>
-        <w:t xml:space="preserve">Task 2.2: Testing what rebuilds it</w:t>
-      </w:r>
-      <w:r>
-        <w:t xml:space="preserve"> </w:t>
-      </w:r>
-      <w:r>
-        <w:t xml:space="preserve">— Which AI transparency labels actually restore trust rather than just adding noise? Output: a survey experiment comparing labelling designs.</w:t>
+        <w:t xml:space="preserve">Task 1.3: Selecting comparative cases</w:t>
+      </w:r>
+      <w:r>
+        <w:t xml:space="preserve"> </w:t>
+      </w:r>
+      <w:r>
+        <w:t xml:space="preserve">— Which cases in the EU, Australia, and Southeast Asia/Pacific give the fullest range of AI’s disruptive power? Output: the project’s comparative case selection.</w:t>
       </w:r>
     </w:p>
     <w:p>
@@ -956,34 +963,13 @@
           <w:b/>
           <w:bCs/>
         </w:rPr>
-        <w:t xml:space="preserve">Task 2.3: Making it usable for institutions</w:t>
-      </w:r>
-      <w:r>
-        <w:t xml:space="preserve"> </w:t>
-      </w:r>
-      <w:r>
-        <w:t xml:space="preserve">— What should an electoral commission actually do with these findings? Output: an electoral-commission brief translating the evidence into practice.</w:t>
-      </w:r>
-    </w:p>
-    <w:p>
-      <w:pPr>
-        <w:numPr>
-          <w:ilvl w:val="0"/>
-          <w:numId w:val="1002"/>
-        </w:numPr>
-      </w:pPr>
-      <w:r>
-        <w:rPr>
-          <w:b/>
-          <w:bCs/>
-        </w:rPr>
-        <w:t xml:space="preserve">Task 2.4: Tracking it over time</w:t>
-      </w:r>
-      <w:r>
-        <w:t xml:space="preserve"> </w:t>
-      </w:r>
-      <w:r>
-        <w:t xml:space="preserve">— How does trust move as AI content and countermeasures evolve? Output: a public trust-tracker dashboard.</w:t>
+        <w:t xml:space="preserve">Task 1.4: Building the diagnostic tool</w:t>
+      </w:r>
+      <w:r>
+        <w:t xml:space="preserve"> </w:t>
+      </w:r>
+      <w:r>
+        <w:t xml:space="preserve">— How can the framework be made usable outside academia? Output: the framework paper, policy briefs, and the Resilience Diagnostic web tool.</w:t>
       </w:r>
     </w:p>
     <w:p>
@@ -1004,14 +990,14 @@
         <w:t xml:space="preserve">€300,000 (preliminary — total project budget ÷ 10 WPs).</w:t>
       </w:r>
     </w:p>
-    <w:bookmarkEnd w:id="32"/>
-    <w:bookmarkStart w:id="33" w:name="wp3-deliberative-democracy-pilot"/>
+    <w:bookmarkEnd w:id="31"/>
+    <w:bookmarkStart w:id="32" w:name="wp2-citizen-trust"/>
     <w:p>
       <w:pPr>
         <w:pStyle w:val="Heading3"/>
       </w:pPr>
       <w:r>
-        <w:t xml:space="preserve">4.3 WP3: Deliberative Democracy Pilot</w:t>
+        <w:t xml:space="preserve">4.2 WP2: Citizen Trust</w:t>
       </w:r>
     </w:p>
     <w:p>
@@ -1029,7 +1015,7 @@
         <w:t xml:space="preserve"> </w:t>
       </w:r>
       <w:r>
-        <w:t xml:space="preserve">Can a structured AI moderator help citizen assemblies find genuine common ground, or does it just manufacture the appearance of consensus?</w:t>
+        <w:t xml:space="preserve">Does exposure to AI-generated political content erode citizens’ trust in democratic institutions, and can calibrated AI transparency tools rebuild it?</w:t>
       </w:r>
     </w:p>
     <w:p>
@@ -1047,7 +1033,7 @@
         <w:t xml:space="preserve"> </w:t>
       </w:r>
       <w:r>
-        <w:t xml:space="preserve">Kolczynska, Webb, Hovy, Kashima, Notely ·</w:t>
+        <w:t xml:space="preserve">Sanhueza Petrarca, Jackman, Kolczynska ·</w:t>
       </w:r>
       <w:r>
         <w:t xml:space="preserve"> </w:t>
@@ -1063,7 +1049,7 @@
         <w:t xml:space="preserve"> </w:t>
       </w:r>
       <w:r>
-        <w:t xml:space="preserve">gives practitioners a tested, field-ready alternative to purely human-facilitated deliberation, with evidence on where AI moderation helps and where it fails.</w:t>
+        <w:t xml:space="preserve">gives electoral commissions and civic educators an evidence-based, field-tested way to counter AI-driven trust erosion rather than guessing at it.</w:t>
       </w:r>
     </w:p>
     <w:p>
@@ -1078,13 +1064,13 @@
           <w:b/>
           <w:bCs/>
         </w:rPr>
-        <w:t xml:space="preserve">Task 3.1: Designing the platform</w:t>
-      </w:r>
-      <w:r>
-        <w:t xml:space="preserve"> </w:t>
-      </w:r>
-      <w:r>
-        <w:t xml:space="preserve">— What does an AI moderator need to do differently from a recommendation algorithm to support rather than distort deliberation? Output: the AI-moderated deliberation platform design.</w:t>
+        <w:t xml:space="preserve">Task 2.1: Measuring the erosion</w:t>
+      </w:r>
+      <w:r>
+        <w:t xml:space="preserve"> </w:t>
+      </w:r>
+      <w:r>
+        <w:t xml:space="preserve">— How much does exposure to AI-generated political content shift citizens’ trust in specific institutions? Output: a panel survey measuring trust before and after exposure, feeding the public-trust index.</w:t>
       </w:r>
     </w:p>
     <w:p>
@@ -1099,13 +1085,13 @@
           <w:b/>
           <w:bCs/>
         </w:rPr>
-        <w:t xml:space="preserve">Task 3.2: Running the live pilot</w:t>
-      </w:r>
-      <w:r>
-        <w:t xml:space="preserve"> </w:t>
-      </w:r>
-      <w:r>
-        <w:t xml:space="preserve">— Does AI moderation change what citizen assemblies actually discuss and agree on? Output: live citizen-assembly pilots run in parallel with human-facilitated sessions.</w:t>
+        <w:t xml:space="preserve">Task 2.2: Testing what rebuilds it</w:t>
+      </w:r>
+      <w:r>
+        <w:t xml:space="preserve"> </w:t>
+      </w:r>
+      <w:r>
+        <w:t xml:space="preserve">— Which AI transparency labels actually restore trust rather than just adding noise? Output: a survey experiment comparing labelling designs.</w:t>
       </w:r>
     </w:p>
     <w:p>
@@ -1120,13 +1106,34 @@
           <w:b/>
           <w:bCs/>
         </w:rPr>
-        <w:t xml:space="preserve">Task 3.3: Comparing outcomes</w:t>
-      </w:r>
-      <w:r>
-        <w:t xml:space="preserve"> </w:t>
-      </w:r>
-      <w:r>
-        <w:t xml:space="preserve">— Where does AI-moderated consensus hold up under scrutiny, and where does it just look like agreement? Output: the comparative paper and a participation-design toolkit for practitioners.</w:t>
+        <w:t xml:space="preserve">Task 2.3: Making it usable for institutions</w:t>
+      </w:r>
+      <w:r>
+        <w:t xml:space="preserve"> </w:t>
+      </w:r>
+      <w:r>
+        <w:t xml:space="preserve">— What should an electoral commission actually do with these findings? Output: an electoral-commission brief translating the evidence into practice.</w:t>
+      </w:r>
+    </w:p>
+    <w:p>
+      <w:pPr>
+        <w:numPr>
+          <w:ilvl w:val="0"/>
+          <w:numId w:val="1003"/>
+        </w:numPr>
+      </w:pPr>
+      <w:r>
+        <w:rPr>
+          <w:b/>
+          <w:bCs/>
+        </w:rPr>
+        <w:t xml:space="preserve">Task 2.4: Tracking it over time</w:t>
+      </w:r>
+      <w:r>
+        <w:t xml:space="preserve"> </w:t>
+      </w:r>
+      <w:r>
+        <w:t xml:space="preserve">— How does trust move as AI content and countermeasures evolve? Output: a public trust-tracker dashboard.</w:t>
       </w:r>
     </w:p>
     <w:p>
@@ -1147,14 +1154,14 @@
         <w:t xml:space="preserve">€300,000 (preliminary — total project budget ÷ 10 WPs).</w:t>
       </w:r>
     </w:p>
-    <w:bookmarkEnd w:id="33"/>
-    <w:bookmarkStart w:id="34" w:name="wp4-disinformation-monitoring"/>
+    <w:bookmarkEnd w:id="32"/>
+    <w:bookmarkStart w:id="33" w:name="wp3-deliberative-democracy-pilot"/>
     <w:p>
       <w:pPr>
         <w:pStyle w:val="Heading3"/>
       </w:pPr>
       <w:r>
-        <w:t xml:space="preserve">4.4 WP4: Disinformation Monitoring</w:t>
+        <w:t xml:space="preserve">4.3 WP3: Deliberative Democracy Pilot</w:t>
       </w:r>
     </w:p>
     <w:p>
@@ -1172,7 +1179,7 @@
         <w:t xml:space="preserve"> </w:t>
       </w:r>
       <w:r>
-        <w:t xml:space="preserve">Can the same generative capability that floods the public sphere with AI-made disinformation be turned into a real-time detection signal for the institutions meant to correct it?</w:t>
+        <w:t xml:space="preserve">Can a structured AI moderator help citizen assemblies find genuine common ground, or does it just manufacture the appearance of consensus?</w:t>
       </w:r>
     </w:p>
     <w:p>
@@ -1190,7 +1197,7 @@
         <w:t xml:space="preserve"> </w:t>
       </w:r>
       <w:r>
-        <w:t xml:space="preserve">Carson, Glazunova, de Kock, Wilson, fact-checking civil-society organisation ·</w:t>
+        <w:t xml:space="preserve">Kolczynska, Webb, Hovy, Kashima, Notely ·</w:t>
       </w:r>
       <w:r>
         <w:t xml:space="preserve"> </w:t>
@@ -1206,7 +1213,7 @@
         <w:t xml:space="preserve"> </w:t>
       </w:r>
       <w:r>
-        <w:t xml:space="preserve">gives regulators and newsrooms a validated, shared detection layer instead of each acting on its own unverified judgment calls.</w:t>
+        <w:t xml:space="preserve">gives practitioners a tested, field-ready alternative to purely human-facilitated deliberation, with evidence on where AI moderation helps and where it fails.</w:t>
       </w:r>
     </w:p>
     <w:p>
@@ -1221,13 +1228,13 @@
           <w:b/>
           <w:bCs/>
         </w:rPr>
-        <w:t xml:space="preserve">Task 4.1: Building the pipeline</w:t>
-      </w:r>
-      <w:r>
-        <w:t xml:space="preserve"> </w:t>
-      </w:r>
-      <w:r>
-        <w:t xml:space="preserve">— What signals reliably distinguish AI-generated disinformation from ordinary misleading content, across countries? Output: the cross-country detection pipeline.</w:t>
+        <w:t xml:space="preserve">Task 3.1: Designing the platform</w:t>
+      </w:r>
+      <w:r>
+        <w:t xml:space="preserve"> </w:t>
+      </w:r>
+      <w:r>
+        <w:t xml:space="preserve">— What does an AI moderator need to do differently from a recommendation algorithm to support rather than distort deliberation? Output: the AI-moderated deliberation platform design.</w:t>
       </w:r>
     </w:p>
     <w:p>
@@ -1242,13 +1249,13 @@
           <w:b/>
           <w:bCs/>
         </w:rPr>
-        <w:t xml:space="preserve">Task 4.2: Validating against real judgments</w:t>
-      </w:r>
-      <w:r>
-        <w:t xml:space="preserve"> </w:t>
-      </w:r>
-      <w:r>
-        <w:t xml:space="preserve">— Does the pipeline’s flagging match what professional fact-checkers actually conclude? Output: validation against partner fact-checkers’ assessments, producing the FAIR dataset.</w:t>
+        <w:t xml:space="preserve">Task 3.2: Running the live pilot</w:t>
+      </w:r>
+      <w:r>
+        <w:t xml:space="preserve"> </w:t>
+      </w:r>
+      <w:r>
+        <w:t xml:space="preserve">— Does AI moderation change what citizen assemblies actually discuss and agree on? Output: live citizen-assembly pilots run in parallel with human-facilitated sessions.</w:t>
       </w:r>
     </w:p>
     <w:p>
@@ -1263,34 +1270,13 @@
           <w:b/>
           <w:bCs/>
         </w:rPr>
-        <w:t xml:space="preserve">Task 4.3: Getting it into institutional hands</w:t>
-      </w:r>
-      <w:r>
-        <w:t xml:space="preserve"> </w:t>
-      </w:r>
-      <w:r>
-        <w:t xml:space="preserve">— What do regulators need from a detection signal to act on it? Output: the regulator brief.</w:t>
-      </w:r>
-    </w:p>
-    <w:p>
-      <w:pPr>
-        <w:numPr>
-          <w:ilvl w:val="0"/>
-          <w:numId w:val="1004"/>
-        </w:numPr>
-      </w:pPr>
-      <w:r>
-        <w:rPr>
-          <w:b/>
-          <w:bCs/>
-        </w:rPr>
-        <w:t xml:space="preserve">Task 4.4: Getting it into newsroom hands</w:t>
-      </w:r>
-      <w:r>
-        <w:t xml:space="preserve"> </w:t>
-      </w:r>
-      <w:r>
-        <w:t xml:space="preserve">— What do time-pressed newsrooms need from a detection signal to use it daily? Output: the fact-check toolkit for newsrooms.</w:t>
+        <w:t xml:space="preserve">Task 3.3: Comparing outcomes</w:t>
+      </w:r>
+      <w:r>
+        <w:t xml:space="preserve"> </w:t>
+      </w:r>
+      <w:r>
+        <w:t xml:space="preserve">— Where does AI-moderated consensus hold up under scrutiny, and where does it just look like agreement? Output: the comparative paper and a participation-design toolkit for practitioners.</w:t>
       </w:r>
     </w:p>
     <w:p>
@@ -1311,14 +1297,14 @@
         <w:t xml:space="preserve">€300,000 (preliminary — total project budget ÷ 10 WPs).</w:t>
       </w:r>
     </w:p>
-    <w:bookmarkEnd w:id="34"/>
-    <w:bookmarkStart w:id="35" w:name="wp5-evidence-integrity"/>
+    <w:bookmarkEnd w:id="33"/>
+    <w:bookmarkStart w:id="34" w:name="wp4-disinformation-monitoring"/>
     <w:p>
       <w:pPr>
         <w:pStyle w:val="Heading3"/>
       </w:pPr>
       <w:r>
-        <w:t xml:space="preserve">4.5 WP5: Evidence Integrity</w:t>
+        <w:t xml:space="preserve">4.4 WP4: Disinformation Monitoring</w:t>
       </w:r>
     </w:p>
     <w:p>
@@ -1336,7 +1322,7 @@
         <w:t xml:space="preserve"> </w:t>
       </w:r>
       <w:r>
-        <w:t xml:space="preserve">Can a certification protocol distinguish AI-fabricated evidence from human-verified evidence reliably enough for newsrooms and the public to trust it?</w:t>
+        <w:t xml:space="preserve">Can the same generative capability that floods the public sphere with AI-made disinformation be turned into a real-time detection signal for the institutions meant to correct it?</w:t>
       </w:r>
     </w:p>
     <w:p>
@@ -1354,7 +1340,7 @@
         <w:t xml:space="preserve"> </w:t>
       </w:r>
       <w:r>
-        <w:t xml:space="preserve">Groemping, O’Brien, Koenig ·</w:t>
+        <w:t xml:space="preserve">Carson, Glazunova, de Kock, Wilson, fact-checking civil-society organisation ·</w:t>
       </w:r>
       <w:r>
         <w:t xml:space="preserve"> </w:t>
@@ -1370,7 +1356,7 @@
         <w:t xml:space="preserve"> </w:t>
       </w:r>
       <w:r>
-        <w:t xml:space="preserve">gives citizens and journalists a shared, checkable standard for what counts as verified evidence in an environment where fabrication is cheap.</w:t>
+        <w:t xml:space="preserve">gives regulators and newsrooms a validated, shared detection layer instead of each acting on its own unverified judgment calls.</w:t>
       </w:r>
     </w:p>
     <w:p>
@@ -1385,13 +1371,13 @@
           <w:b/>
           <w:bCs/>
         </w:rPr>
-        <w:t xml:space="preserve">Task 5.1: Designing the protocol</w:t>
-      </w:r>
-      <w:r>
-        <w:t xml:space="preserve"> </w:t>
-      </w:r>
-      <w:r>
-        <w:t xml:space="preserve">— What provenance markers can reliably separate AI-generated from human-verified evidence? Output: the provenance-tagging and certification protocol.</w:t>
+        <w:t xml:space="preserve">Task 4.1: Building the pipeline</w:t>
+      </w:r>
+      <w:r>
+        <w:t xml:space="preserve"> </w:t>
+      </w:r>
+      <w:r>
+        <w:t xml:space="preserve">— What signals reliably distinguish AI-generated disinformation from ordinary misleading content, across countries? Output: the cross-country detection pipeline.</w:t>
       </w:r>
     </w:p>
     <w:p>
@@ -1406,13 +1392,13 @@
           <w:b/>
           <w:bCs/>
         </w:rPr>
-        <w:t xml:space="preserve">Task 5.2: Testing it with real users</w:t>
-      </w:r>
-      <w:r>
-        <w:t xml:space="preserve"> </w:t>
-      </w:r>
-      <w:r>
-        <w:t xml:space="preserve">— Does the protocol hold up when newsroom partners actually try to use it under deadline pressure? Output: field-testing with newsroom partners, feeding the paper.</w:t>
+        <w:t xml:space="preserve">Task 4.2: Validating against real judgments</w:t>
+      </w:r>
+      <w:r>
+        <w:t xml:space="preserve"> </w:t>
+      </w:r>
+      <w:r>
+        <w:t xml:space="preserve">— Does the pipeline’s flagging match what professional fact-checkers actually conclude? Output: validation against partner fact-checkers’ assessments, producing the FAIR dataset.</w:t>
       </w:r>
     </w:p>
     <w:p>
@@ -1427,13 +1413,34 @@
           <w:b/>
           <w:bCs/>
         </w:rPr>
-        <w:t xml:space="preserve">Task 5.3: Making it publicly checkable</w:t>
-      </w:r>
-      <w:r>
-        <w:t xml:space="preserve"> </w:t>
-      </w:r>
-      <w:r>
-        <w:t xml:space="preserve">— How can anyone, not just partner newsrooms, verify a piece of evidence’s certification status? Output: the certification toolkit and public verification API.</w:t>
+        <w:t xml:space="preserve">Task 4.3: Getting it into institutional hands</w:t>
+      </w:r>
+      <w:r>
+        <w:t xml:space="preserve"> </w:t>
+      </w:r>
+      <w:r>
+        <w:t xml:space="preserve">— What do regulators need from a detection signal to act on it? Output: the regulator brief.</w:t>
+      </w:r>
+    </w:p>
+    <w:p>
+      <w:pPr>
+        <w:numPr>
+          <w:ilvl w:val="0"/>
+          <w:numId w:val="1005"/>
+        </w:numPr>
+      </w:pPr>
+      <w:r>
+        <w:rPr>
+          <w:b/>
+          <w:bCs/>
+        </w:rPr>
+        <w:t xml:space="preserve">Task 4.4: Getting it into newsroom hands</w:t>
+      </w:r>
+      <w:r>
+        <w:t xml:space="preserve"> </w:t>
+      </w:r>
+      <w:r>
+        <w:t xml:space="preserve">— What do time-pressed newsrooms need from a detection signal to use it daily? Output: the fact-check toolkit for newsrooms.</w:t>
       </w:r>
     </w:p>
     <w:p>
@@ -1454,14 +1461,14 @@
         <w:t xml:space="preserve">€300,000 (preliminary — total project budget ÷ 10 WPs).</w:t>
       </w:r>
     </w:p>
-    <w:bookmarkEnd w:id="35"/>
-    <w:bookmarkStart w:id="36" w:name="wp6-repression-monitoring"/>
+    <w:bookmarkEnd w:id="34"/>
+    <w:bookmarkStart w:id="35" w:name="wp5-evidence-integrity"/>
     <w:p>
       <w:pPr>
         <w:pStyle w:val="Heading3"/>
       </w:pPr>
       <w:r>
-        <w:t xml:space="preserve">4.6 WP6: Repression Monitoring</w:t>
+        <w:t xml:space="preserve">4.5 WP5: Evidence Integrity</w:t>
       </w:r>
     </w:p>
     <w:p>
@@ -1479,7 +1486,7 @@
         <w:t xml:space="preserve"> </w:t>
       </w:r>
       <w:r>
-        <w:t xml:space="preserve">Does AI-enabled surveillance and censorship concentrate hardest in states with the weakest oversight, and can tracking that pattern itself become an early-warning signal?</w:t>
+        <w:t xml:space="preserve">Can a certification protocol distinguish AI-fabricated evidence from human-verified evidence reliably enough for newsrooms and the public to trust it?</w:t>
       </w:r>
     </w:p>
     <w:p>
@@ -1497,7 +1504,7 @@
         <w:t xml:space="preserve"> </w:t>
       </w:r>
       <w:r>
-        <w:t xml:space="preserve">Wilson, Knutsen, Croissant, Sombatpoonsiri, Maerz ·</w:t>
+        <w:t xml:space="preserve">Groemping, O’Brien, Koenig ·</w:t>
       </w:r>
       <w:r>
         <w:t xml:space="preserve"> </w:t>
@@ -1513,7 +1520,7 @@
         <w:t xml:space="preserve"> </w:t>
       </w:r>
       <w:r>
-        <w:t xml:space="preserve">gives human-rights monitors a standing, updated signal instead of relying on episodic, after-the-fact reporting.</w:t>
+        <w:t xml:space="preserve">gives citizens and journalists a shared, checkable standard for what counts as verified evidence in an environment where fabrication is cheap.</w:t>
       </w:r>
     </w:p>
     <w:p>
@@ -1528,13 +1535,13 @@
           <w:b/>
           <w:bCs/>
         </w:rPr>
-        <w:t xml:space="preserve">Task 6.1: Tracking deployment</w:t>
-      </w:r>
-      <w:r>
-        <w:t xml:space="preserve"> </w:t>
-      </w:r>
-      <w:r>
-        <w:t xml:space="preserve">— Which AI-enabled surveillance and censorship tools are backsliding states actually deploying, and where? Output: expert-coded tracking across cases.</w:t>
+        <w:t xml:space="preserve">Task 5.1: Designing the protocol</w:t>
+      </w:r>
+      <w:r>
+        <w:t xml:space="preserve"> </w:t>
+      </w:r>
+      <w:r>
+        <w:t xml:space="preserve">— What provenance markers can reliably separate AI-generated from human-verified evidence? Output: the provenance-tagging and certification protocol.</w:t>
       </w:r>
     </w:p>
     <w:p>
@@ -1549,13 +1556,13 @@
           <w:b/>
           <w:bCs/>
         </w:rPr>
-        <w:t xml:space="preserve">Task 6.2: Automating the signal</w:t>
-      </w:r>
-      <w:r>
-        <w:t xml:space="preserve"> </w:t>
-      </w:r>
-      <w:r>
-        <w:t xml:space="preserve">— Can automated media monitoring catch deployment as it happens, rather than months later? Output: the automated media-monitoring component.</w:t>
+        <w:t xml:space="preserve">Task 5.2: Testing it with real users</w:t>
+      </w:r>
+      <w:r>
+        <w:t xml:space="preserve"> </w:t>
+      </w:r>
+      <w:r>
+        <w:t xml:space="preserve">— Does the protocol hold up when newsroom partners actually try to use it under deadline pressure? Output: field-testing with newsroom partners, feeding the paper.</w:t>
       </w:r>
     </w:p>
     <w:p>
@@ -1570,13 +1577,13 @@
           <w:b/>
           <w:bCs/>
         </w:rPr>
-        <w:t xml:space="preserve">Task 6.3: Turning tracking into warning</w:t>
-      </w:r>
-      <w:r>
-        <w:t xml:space="preserve"> </w:t>
-      </w:r>
-      <w:r>
-        <w:t xml:space="preserve">— What pattern in this tracking data actually predicts further backsliding, early enough to act on? Output: the paper and the early-warning dashboard for human-rights monitors.</w:t>
+        <w:t xml:space="preserve">Task 5.3: Making it publicly checkable</w:t>
+      </w:r>
+      <w:r>
+        <w:t xml:space="preserve"> </w:t>
+      </w:r>
+      <w:r>
+        <w:t xml:space="preserve">— How can anyone, not just partner newsrooms, verify a piece of evidence’s certification status? Output: the certification toolkit and public verification API.</w:t>
       </w:r>
     </w:p>
     <w:p>
@@ -1597,14 +1604,14 @@
         <w:t xml:space="preserve">€300,000 (preliminary — total project budget ÷ 10 WPs).</w:t>
       </w:r>
     </w:p>
-    <w:bookmarkEnd w:id="36"/>
-    <w:bookmarkStart w:id="37" w:name="wp7-ai-governance"/>
+    <w:bookmarkEnd w:id="35"/>
+    <w:bookmarkStart w:id="36" w:name="wp6-repression-monitoring"/>
     <w:p>
       <w:pPr>
         <w:pStyle w:val="Heading3"/>
       </w:pPr>
       <w:r>
-        <w:t xml:space="preserve">4.7 WP7: AI Governance</w:t>
+        <w:t xml:space="preserve">4.6 WP6: Repression Monitoring</w:t>
       </w:r>
     </w:p>
     <w:p>
@@ -1622,7 +1629,7 @@
         <w:t xml:space="preserve"> </w:t>
       </w:r>
       <w:r>
-        <w:t xml:space="preserve">Do existing AI governance regimes actually require the transparency, audit, and redress that informational accountability depends on, or do they leave institutions free to evade scrutiny?</w:t>
+        <w:t xml:space="preserve">Does AI-enabled surveillance and censorship concentrate hardest in states with the weakest oversight, and can tracking that pattern itself become an early-warning signal?</w:t>
       </w:r>
     </w:p>
     <w:p>
@@ -1640,7 +1647,7 @@
         <w:t xml:space="preserve"> </w:t>
       </w:r>
       <w:r>
-        <w:t xml:space="preserve">Koenig ·</w:t>
+        <w:t xml:space="preserve">Wilson, Knutsen, Croissant, Sombatpoonsiri, Maerz ·</w:t>
       </w:r>
       <w:r>
         <w:t xml:space="preserve"> </w:t>
@@ -1656,7 +1663,7 @@
         <w:t xml:space="preserve"> </w:t>
       </w:r>
       <w:r>
-        <w:t xml:space="preserve">gives policymakers a concrete, comparative basis for closing the gap between what AI governance promises and what it actually enforces.</w:t>
+        <w:t xml:space="preserve">gives human-rights monitors a standing, updated signal instead of relying on episodic, after-the-fact reporting.</w:t>
       </w:r>
     </w:p>
     <w:p>
@@ -1671,13 +1678,13 @@
           <w:b/>
           <w:bCs/>
         </w:rPr>
-        <w:t xml:space="preserve">Task 7.1: Mapping what’s on the books</w:t>
-      </w:r>
-      <w:r>
-        <w:t xml:space="preserve"> </w:t>
-      </w:r>
-      <w:r>
-        <w:t xml:space="preserve">— What do AI governance regimes in the EU, Australia, and Southeast Asia/Pacific formally require of AI-mediated institutional decisions? Output: the regulatory-comparison tracker.</w:t>
+        <w:t xml:space="preserve">Task 6.1: Tracking deployment</w:t>
+      </w:r>
+      <w:r>
+        <w:t xml:space="preserve"> </w:t>
+      </w:r>
+      <w:r>
+        <w:t xml:space="preserve">— Which AI-enabled surveillance and censorship tools are backsliding states actually deploying, and where? Output: expert-coded tracking across cases.</w:t>
       </w:r>
     </w:p>
     <w:p>
@@ -1692,13 +1699,13 @@
           <w:b/>
           <w:bCs/>
         </w:rPr>
-        <w:t xml:space="preserve">Task 7.2: Testing enforcement</w:t>
-      </w:r>
-      <w:r>
-        <w:t xml:space="preserve"> </w:t>
-      </w:r>
-      <w:r>
-        <w:t xml:space="preserve">— Which of these formal requirements are actually enforced, and which are checkbox compliance? Output: the comparative paper.</w:t>
+        <w:t xml:space="preserve">Task 6.2: Automating the signal</w:t>
+      </w:r>
+      <w:r>
+        <w:t xml:space="preserve"> </w:t>
+      </w:r>
+      <w:r>
+        <w:t xml:space="preserve">— Can automated media monitoring catch deployment as it happens, rather than months later? Output: the automated media-monitoring component.</w:t>
       </w:r>
     </w:p>
     <w:p>
@@ -1713,13 +1720,13 @@
           <w:b/>
           <w:bCs/>
         </w:rPr>
-        <w:t xml:space="preserve">Task 7.3: Identifying what travels</w:t>
-      </w:r>
-      <w:r>
-        <w:t xml:space="preserve"> </w:t>
-      </w:r>
-      <w:r>
-        <w:t xml:space="preserve">— Which accountability provisions transfer across very different regulatory contexts, and which don’t? Output: policy recommendations.</w:t>
+        <w:t xml:space="preserve">Task 6.3: Turning tracking into warning</w:t>
+      </w:r>
+      <w:r>
+        <w:t xml:space="preserve"> </w:t>
+      </w:r>
+      <w:r>
+        <w:t xml:space="preserve">— What pattern in this tracking data actually predicts further backsliding, early enough to act on? Output: the paper and the early-warning dashboard for human-rights monitors.</w:t>
       </w:r>
     </w:p>
     <w:p>
@@ -1740,14 +1747,14 @@
         <w:t xml:space="preserve">€300,000 (preliminary — total project budget ÷ 10 WPs).</w:t>
       </w:r>
     </w:p>
-    <w:bookmarkEnd w:id="37"/>
-    <w:bookmarkStart w:id="38" w:name="wp8-resilience-radar"/>
+    <w:bookmarkEnd w:id="36"/>
+    <w:bookmarkStart w:id="37" w:name="wp7-ai-governance"/>
     <w:p>
       <w:pPr>
         <w:pStyle w:val="Heading3"/>
       </w:pPr>
       <w:r>
-        <w:t xml:space="preserve">4.8 WP8: Resilience Radar</w:t>
+        <w:t xml:space="preserve">4.7 WP7: AI Governance</w:t>
       </w:r>
     </w:p>
     <w:p>
@@ -1765,7 +1772,7 @@
         <w:t xml:space="preserve"> </w:t>
       </w:r>
       <w:r>
-        <w:t xml:space="preserve">Can the separate indicators produced across WP2–WP7 be integrated into one shared panel sensitive enough to flag democratic-resilience shifts as they happen, rather than after the fact?</w:t>
+        <w:t xml:space="preserve">Do existing AI governance regimes actually require the transparency, audit, and redress that informational accountability depends on, or do they leave institutions free to evade scrutiny?</w:t>
       </w:r>
     </w:p>
     <w:p>
@@ -1783,7 +1790,7 @@
         <w:t xml:space="preserve"> </w:t>
       </w:r>
       <w:r>
-        <w:t xml:space="preserve">Sebok, Croissant, Maerz ·</w:t>
+        <w:t xml:space="preserve">Koenig ·</w:t>
       </w:r>
       <w:r>
         <w:t xml:space="preserve"> </w:t>
@@ -1799,7 +1806,7 @@
         <w:t xml:space="preserve"> </w:t>
       </w:r>
       <w:r>
-        <w:t xml:space="preserve">turns findings that would otherwise sit in separate WP silos into one standing, cross-country monitoring instrument.</w:t>
+        <w:t xml:space="preserve">gives policymakers a concrete, comparative basis for closing the gap between what AI governance promises and what it actually enforces.</w:t>
       </w:r>
     </w:p>
     <w:p>
@@ -1814,13 +1821,13 @@
           <w:b/>
           <w:bCs/>
         </w:rPr>
-        <w:t xml:space="preserve">Task 8.1: Integrating the indicators</w:t>
-      </w:r>
-      <w:r>
-        <w:t xml:space="preserve"> </w:t>
-      </w:r>
-      <w:r>
-        <w:t xml:space="preserve">— How compatible are the indicators coming out of WP2–WP7, and what does it take to put them on one common panel? Output: the integrated cross-country panel.</w:t>
+        <w:t xml:space="preserve">Task 7.1: Mapping what’s on the books</w:t>
+      </w:r>
+      <w:r>
+        <w:t xml:space="preserve"> </w:t>
+      </w:r>
+      <w:r>
+        <w:t xml:space="preserve">— What do AI governance regimes in the EU, Australia, and Southeast Asia/Pacific formally require of AI-mediated institutional decisions? Output: the regulatory-comparison tracker.</w:t>
       </w:r>
     </w:p>
     <w:p>
@@ -1835,13 +1842,13 @@
           <w:b/>
           <w:bCs/>
         </w:rPr>
-        <w:t xml:space="preserve">Task 8.2: Building the classifier</w:t>
-      </w:r>
-      <w:r>
-        <w:t xml:space="preserve"> </w:t>
-      </w:r>
-      <w:r>
-        <w:t xml:space="preserve">— Can an LLM classifier trained on this panel reliably distinguish real resilience shifts from noise? Output: the trained LLM classifier and methods paper.</w:t>
+        <w:t xml:space="preserve">Task 7.2: Testing enforcement</w:t>
+      </w:r>
+      <w:r>
+        <w:t xml:space="preserve"> </w:t>
+      </w:r>
+      <w:r>
+        <w:t xml:space="preserve">— Which of these formal requirements are actually enforced, and which are checkbox compliance? Output: the comparative paper.</w:t>
       </w:r>
     </w:p>
     <w:p>
@@ -1856,13 +1863,13 @@
           <w:b/>
           <w:bCs/>
         </w:rPr>
-        <w:t xml:space="preserve">Task 8.3: Making it public</w:t>
-      </w:r>
-      <w:r>
-        <w:t xml:space="preserve"> </w:t>
-      </w:r>
-      <w:r>
-        <w:t xml:space="preserve">— How should this signal be presented so outside users can actually act on it? Output: the FAIR toolkit and the Resilience Radar dashboard.</w:t>
+        <w:t xml:space="preserve">Task 7.3: Identifying what travels</w:t>
+      </w:r>
+      <w:r>
+        <w:t xml:space="preserve"> </w:t>
+      </w:r>
+      <w:r>
+        <w:t xml:space="preserve">— Which accountability provisions transfer across very different regulatory contexts, and which don’t? Output: policy recommendations.</w:t>
       </w:r>
     </w:p>
     <w:p>
@@ -1883,14 +1890,14 @@
         <w:t xml:space="preserve">€300,000 (preliminary — total project budget ÷ 10 WPs).</w:t>
       </w:r>
     </w:p>
-    <w:bookmarkEnd w:id="38"/>
-    <w:bookmarkStart w:id="39" w:name="wp9-equitable-ai-literacy"/>
+    <w:bookmarkEnd w:id="37"/>
+    <w:bookmarkStart w:id="38" w:name="wp8-resilience-radar"/>
     <w:p>
       <w:pPr>
         <w:pStyle w:val="Heading3"/>
       </w:pPr>
       <w:r>
-        <w:t xml:space="preserve">4.9 WP9: Equitable AI Literacy</w:t>
+        <w:t xml:space="preserve">4.8 WP8: Resilience Radar</w:t>
       </w:r>
     </w:p>
     <w:p>
@@ -1908,7 +1915,7 @@
         <w:t xml:space="preserve"> </w:t>
       </w:r>
       <w:r>
-        <w:t xml:space="preserve">Which AI-literacy training formats actually close the gap in underserved communities’ capacity to identify and contest AI-mediated content, rather than just reaching those already equipped to cope?</w:t>
+        <w:t xml:space="preserve">Can the separate indicators produced across WP2–WP7 be integrated into one shared panel sensitive enough to flag democratic-resilience shifts as they happen, rather than after the fact?</w:t>
       </w:r>
     </w:p>
     <w:p>
@@ -1926,7 +1933,7 @@
         <w:t xml:space="preserve"> </w:t>
       </w:r>
       <w:r>
-        <w:t xml:space="preserve">Tactical Tech, Notely, Williams ·</w:t>
+        <w:t xml:space="preserve">Sebok, Croissant, Maerz ·</w:t>
       </w:r>
       <w:r>
         <w:t xml:space="preserve"> </w:t>
@@ -1942,7 +1949,7 @@
         <w:t xml:space="preserve"> </w:t>
       </w:r>
       <w:r>
-        <w:t xml:space="preserve">turns equity from an aggregate afterthought into WP9’s direct object, giving underserved communities the same practical capacity to contest AI-mediated decisions that better-resourced groups already have.</w:t>
+        <w:t xml:space="preserve">turns findings that would otherwise sit in separate WP silos into one standing, cross-country monitoring instrument.</w:t>
       </w:r>
     </w:p>
     <w:p>
@@ -1957,13 +1964,13 @@
           <w:b/>
           <w:bCs/>
         </w:rPr>
-        <w:t xml:space="preserve">Task 9.1: Co-designing with the communities affected</w:t>
-      </w:r>
-      <w:r>
-        <w:t xml:space="preserve"> </w:t>
-      </w:r>
-      <w:r>
-        <w:t xml:space="preserve">— What do underserved communities themselves identify as the gap in their ability to engage with AI-mediated content? Output: co-designed curriculum content.</w:t>
+        <w:t xml:space="preserve">Task 8.1: Integrating the indicators</w:t>
+      </w:r>
+      <w:r>
+        <w:t xml:space="preserve"> </w:t>
+      </w:r>
+      <w:r>
+        <w:t xml:space="preserve">— How compatible are the indicators coming out of WP2–WP7, and what does it take to put them on one common panel? Output: the integrated cross-country panel.</w:t>
       </w:r>
     </w:p>
     <w:p>
@@ -1978,13 +1985,13 @@
           <w:b/>
           <w:bCs/>
         </w:rPr>
-        <w:t xml:space="preserve">Task 9.2: Piloting formats head-to-head</w:t>
-      </w:r>
-      <w:r>
-        <w:t xml:space="preserve"> </w:t>
-      </w:r>
-      <w:r>
-        <w:t xml:space="preserve">— Which training formats and delivery modes, tested against each other, close the gap fastest? Output: the pilot comparing formats.</w:t>
+        <w:t xml:space="preserve">Task 8.2: Building the classifier</w:t>
+      </w:r>
+      <w:r>
+        <w:t xml:space="preserve"> </w:t>
+      </w:r>
+      <w:r>
+        <w:t xml:space="preserve">— Can an LLM classifier trained on this panel reliably distinguish real resilience shifts from noise? Output: the trained LLM classifier and methods paper.</w:t>
       </w:r>
     </w:p>
     <w:p>
@@ -1999,34 +2006,13 @@
           <w:b/>
           <w:bCs/>
         </w:rPr>
-        <w:t xml:space="preserve">Task 9.3: Packaging what works</w:t>
-      </w:r>
-      <w:r>
-        <w:t xml:space="preserve"> </w:t>
-      </w:r>
-      <w:r>
-        <w:t xml:space="preserve">— How can the format that works best be packaged for reuse beyond the pilot communities? Output: the accessible AI-literacy curriculum and training toolkit.</w:t>
-      </w:r>
-    </w:p>
-    <w:p>
-      <w:pPr>
-        <w:numPr>
-          <w:ilvl w:val="0"/>
-          <w:numId w:val="1009"/>
-        </w:numPr>
-      </w:pPr>
-      <w:r>
-        <w:rPr>
-          <w:b/>
-          <w:bCs/>
-        </w:rPr>
-        <w:t xml:space="preserve">Task 9.4: Documenting the gap</w:t>
-      </w:r>
-      <w:r>
-        <w:t xml:space="preserve"> </w:t>
-      </w:r>
-      <w:r>
-        <w:t xml:space="preserve">— How large is the equity gap in AI-mediated participation, and how much does it close? Output: the paper on the equity gap.</w:t>
+        <w:t xml:space="preserve">Task 8.3: Making it public</w:t>
+      </w:r>
+      <w:r>
+        <w:t xml:space="preserve"> </w:t>
+      </w:r>
+      <w:r>
+        <w:t xml:space="preserve">— How should this signal be presented so outside users can actually act on it? Output: the FAIR toolkit and the Resilience Radar dashboard.</w:t>
       </w:r>
     </w:p>
     <w:p>
@@ -2047,14 +2033,14 @@
         <w:t xml:space="preserve">€300,000 (preliminary — total project budget ÷ 10 WPs).</w:t>
       </w:r>
     </w:p>
-    <w:bookmarkEnd w:id="39"/>
-    <w:bookmarkStart w:id="40" w:name="wp10-public-engagement-dissemination"/>
+    <w:bookmarkEnd w:id="38"/>
+    <w:bookmarkStart w:id="39" w:name="wp9-equitable-ai-literacy"/>
     <w:p>
       <w:pPr>
         <w:pStyle w:val="Heading3"/>
       </w:pPr>
       <w:r>
-        <w:t xml:space="preserve">4.10 WP10: Public Engagement &amp; Dissemination</w:t>
+        <w:t xml:space="preserve">4.9 WP9: Equitable AI Literacy</w:t>
       </w:r>
     </w:p>
     <w:p>
@@ -2072,7 +2058,7 @@
         <w:t xml:space="preserve"> </w:t>
       </w:r>
       <w:r>
-        <w:t xml:space="preserve">How can the diagnoses and tools produced across WP1–WP9 reach the citizens, policymakers, and civil-society actors who are actually exposed to AI’s disruption of democratic resilience?</w:t>
+        <w:t xml:space="preserve">Which AI-literacy training formats actually close the gap in underserved communities’ capacity to identify and contest AI-mediated content, rather than just reaching those already equipped to cope?</w:t>
       </w:r>
     </w:p>
     <w:p>
@@ -2090,7 +2076,7 @@
         <w:t xml:space="preserve"> </w:t>
       </w:r>
       <w:r>
-        <w:t xml:space="preserve">Maerz, UniMelb Research Office, Tactical Tech ·</w:t>
+        <w:t xml:space="preserve">Tactical Tech, Notely, Williams ·</w:t>
       </w:r>
       <w:r>
         <w:t xml:space="preserve"> </w:t>
@@ -2106,7 +2092,7 @@
         <w:t xml:space="preserve"> </w:t>
       </w:r>
       <w:r>
-        <w:t xml:space="preserve">closes the loop between diagnosis and use, so the project’s findings change practice rather than sitting in academic outputs alone.</w:t>
+        <w:t xml:space="preserve">turns equity from an aggregate afterthought into WP9’s direct object, giving underserved communities the same practical capacity to contest AI-mediated decisions that better-resourced groups already have.</w:t>
       </w:r>
     </w:p>
     <w:p>
@@ -2121,13 +2107,13 @@
           <w:b/>
           <w:bCs/>
         </w:rPr>
-        <w:t xml:space="preserve">Task 10.1: Building the public-facing tool</w:t>
-      </w:r>
-      <w:r>
-        <w:t xml:space="preserve"> </w:t>
-      </w:r>
-      <w:r>
-        <w:t xml:space="preserve">— How can nine WPs’ worth of technical findings become one usable app for ordinary citizens? Output: the Resilience Companion app launch.</w:t>
+        <w:t xml:space="preserve">Task 9.1: Co-designing with the communities affected</w:t>
+      </w:r>
+      <w:r>
+        <w:t xml:space="preserve"> </w:t>
+      </w:r>
+      <w:r>
+        <w:t xml:space="preserve">— What do underserved communities themselves identify as the gap in their ability to engage with AI-mediated content? Output: co-designed curriculum content.</w:t>
       </w:r>
     </w:p>
     <w:p>
@@ -2142,13 +2128,13 @@
           <w:b/>
           <w:bCs/>
         </w:rPr>
-        <w:t xml:space="preserve">Task 10.2: Reaching policymakers and civil society</w:t>
-      </w:r>
-      <w:r>
-        <w:t xml:space="preserve"> </w:t>
-      </w:r>
-      <w:r>
-        <w:t xml:space="preserve">— What do policymakers and civil-society partners need from this project to actually act on it? Output: policymaker and civil-society workshops, and the brief compendium.</w:t>
+        <w:t xml:space="preserve">Task 9.2: Piloting formats head-to-head</w:t>
+      </w:r>
+      <w:r>
+        <w:t xml:space="preserve"> </w:t>
+      </w:r>
+      <w:r>
+        <w:t xml:space="preserve">— Which training formats and delivery modes, tested against each other, close the gap fastest? Output: the pilot comparing formats.</w:t>
       </w:r>
     </w:p>
     <w:p>
@@ -2156,6 +2142,170 @@
         <w:numPr>
           <w:ilvl w:val="0"/>
           <w:numId w:val="1010"/>
+        </w:numPr>
+      </w:pPr>
+      <w:r>
+        <w:rPr>
+          <w:b/>
+          <w:bCs/>
+        </w:rPr>
+        <w:t xml:space="preserve">Task 9.3: Packaging what works</w:t>
+      </w:r>
+      <w:r>
+        <w:t xml:space="preserve"> </w:t>
+      </w:r>
+      <w:r>
+        <w:t xml:space="preserve">— How can the format that works best be packaged for reuse beyond the pilot communities? Output: the accessible AI-literacy curriculum and training toolkit.</w:t>
+      </w:r>
+    </w:p>
+    <w:p>
+      <w:pPr>
+        <w:numPr>
+          <w:ilvl w:val="0"/>
+          <w:numId w:val="1010"/>
+        </w:numPr>
+      </w:pPr>
+      <w:r>
+        <w:rPr>
+          <w:b/>
+          <w:bCs/>
+        </w:rPr>
+        <w:t xml:space="preserve">Task 9.4: Documenting the gap</w:t>
+      </w:r>
+      <w:r>
+        <w:t xml:space="preserve"> </w:t>
+      </w:r>
+      <w:r>
+        <w:t xml:space="preserve">— How large is the equity gap in AI-mediated participation, and how much does it close? Output: the paper on the equity gap.</w:t>
+      </w:r>
+    </w:p>
+    <w:p>
+      <w:pPr>
+        <w:pStyle w:val="FirstParagraph"/>
+      </w:pPr>
+      <w:r>
+        <w:rPr>
+          <w:b/>
+          <w:bCs/>
+        </w:rPr>
+        <w:t xml:space="preserve">Preliminary budget:</w:t>
+      </w:r>
+      <w:r>
+        <w:t xml:space="preserve"> </w:t>
+      </w:r>
+      <w:r>
+        <w:t xml:space="preserve">€300,000 (preliminary — total project budget ÷ 10 WPs).</w:t>
+      </w:r>
+    </w:p>
+    <w:bookmarkEnd w:id="39"/>
+    <w:bookmarkStart w:id="40" w:name="wp10-public-engagement-dissemination"/>
+    <w:p>
+      <w:pPr>
+        <w:pStyle w:val="Heading3"/>
+      </w:pPr>
+      <w:r>
+        <w:t xml:space="preserve">4.10 WP10: Public Engagement &amp; Dissemination</w:t>
+      </w:r>
+    </w:p>
+    <w:p>
+      <w:pPr>
+        <w:pStyle w:val="FirstParagraph"/>
+      </w:pPr>
+      <w:r>
+        <w:rPr>
+          <w:b/>
+          <w:bCs/>
+        </w:rPr>
+        <w:t xml:space="preserve">Research question:</w:t>
+      </w:r>
+      <w:r>
+        <w:t xml:space="preserve"> </w:t>
+      </w:r>
+      <w:r>
+        <w:t xml:space="preserve">How can the diagnoses and tools produced across WP1–WP9 reach the citizens, policymakers, and civil-society actors who are actually exposed to AI’s disruption of democratic resilience?</w:t>
+      </w:r>
+    </w:p>
+    <w:p>
+      <w:pPr>
+        <w:pStyle w:val="BodyText"/>
+      </w:pPr>
+      <w:r>
+        <w:rPr>
+          <w:b/>
+          <w:bCs/>
+        </w:rPr>
+        <w:t xml:space="preserve">Lead:</w:t>
+      </w:r>
+      <w:r>
+        <w:t xml:space="preserve"> </w:t>
+      </w:r>
+      <w:r>
+        <w:t xml:space="preserve">Maerz, UniMelb Research Office, Tactical Tech ·</w:t>
+      </w:r>
+      <w:r>
+        <w:t xml:space="preserve"> </w:t>
+      </w:r>
+      <w:r>
+        <w:rPr>
+          <w:b/>
+          <w:bCs/>
+        </w:rPr>
+        <w:t xml:space="preserve">Impact:</w:t>
+      </w:r>
+      <w:r>
+        <w:t xml:space="preserve"> </w:t>
+      </w:r>
+      <w:r>
+        <w:t xml:space="preserve">closes the loop between diagnosis and use, so the project’s findings change practice rather than sitting in academic outputs alone.</w:t>
+      </w:r>
+    </w:p>
+    <w:p>
+      <w:pPr>
+        <w:numPr>
+          <w:ilvl w:val="0"/>
+          <w:numId w:val="1011"/>
+        </w:numPr>
+      </w:pPr>
+      <w:r>
+        <w:rPr>
+          <w:b/>
+          <w:bCs/>
+        </w:rPr>
+        <w:t xml:space="preserve">Task 10.1: Building the public-facing tool</w:t>
+      </w:r>
+      <w:r>
+        <w:t xml:space="preserve"> </w:t>
+      </w:r>
+      <w:r>
+        <w:t xml:space="preserve">— How can nine WPs’ worth of technical findings become one usable app for ordinary citizens? Output: the Resilience Companion app launch.</w:t>
+      </w:r>
+    </w:p>
+    <w:p>
+      <w:pPr>
+        <w:numPr>
+          <w:ilvl w:val="0"/>
+          <w:numId w:val="1011"/>
+        </w:numPr>
+      </w:pPr>
+      <w:r>
+        <w:rPr>
+          <w:b/>
+          <w:bCs/>
+        </w:rPr>
+        <w:t xml:space="preserve">Task 10.2: Reaching policymakers and civil society</w:t>
+      </w:r>
+      <w:r>
+        <w:t xml:space="preserve"> </w:t>
+      </w:r>
+      <w:r>
+        <w:t xml:space="preserve">— What do policymakers and civil-society partners need from this project to actually act on it? Output: policymaker and civil-society workshops, and the brief compendium.</w:t>
+      </w:r>
+    </w:p>
+    <w:p>
+      <w:pPr>
+        <w:numPr>
+          <w:ilvl w:val="0"/>
+          <w:numId w:val="1011"/>
         </w:numPr>
       </w:pPr>
       <w:r>
@@ -4234,6 +4384,9 @@
     <w:abstractNumId w:val="991"/>
   </w:num>
   <w:num w:numId="1010">
+    <w:abstractNumId w:val="991"/>
+  </w:num>
+  <w:num w:numId="1011">
     <w:abstractNumId w:val="991"/>
   </w:num>
 </w:numbering>

</xml_diff>